<commit_message>
Nightly backup 2026-07-20 20:30
</commit_message>
<xml_diff>
--- a/Operations/Otto/Work/To-Do_2026-07-17.docx
+++ b/Operations/Otto/Work/To-Do_2026-07-17.docx
@@ -62,29 +62,7 @@
         <w:spacing w:after="120"/>
       </w:pPr>
       <w:r>
-        <w:t xml:space="preserve">☐ Close Beta</w:t>
-      </w:r>
-      <w:r>
-        <w:rPr>
-          <w:color w:val="666666"/>
-        </w:rPr>
-        <w:t xml:space="preserve">   SOP: </w:t>
-      </w:r>
-      <w:hyperlink w:history="1" r:id="rIdulime1-tuwqd3oumvssm8">
-        <w:r>
-          <w:rPr>
-            <w:rStyle w:val="Hyperlink"/>
-          </w:rPr>
-          <w:t xml:space="preserve">Project closing (financial close)</w:t>
-        </w:r>
-      </w:hyperlink>
-    </w:p>
-    <w:p>
-      <w:pPr>
-        <w:spacing w:after="120"/>
-      </w:pPr>
-      <w:r>
-        <w:t xml:space="preserve">☐ Put Dylan at BNY on the nurturing list</w:t>
+        <w:t xml:space="preserve">☐ Schedule sales calls with Nord, 1Password, and Dashlane (password manager / VPN)</w:t>
       </w:r>
       <w:r>
         <w:rPr>
@@ -97,86 +75,6 @@
     </w:p>
     <w:p>
       <w:pPr>
-        <w:spacing w:after="120"/>
-      </w:pPr>
-      <w:r>
-        <w:t xml:space="preserve">☐ Review lost deals from the last 12 months to resurrect</w:t>
-      </w:r>
-      <w:r>
-        <w:rPr>
-          <w:i/>
-          <w:iCs/>
-          <w:color w:val="999999"/>
-        </w:rPr>
-        <w:t xml:space="preserve">   no SOP yet; consider adding one</w:t>
-      </w:r>
-    </w:p>
-    <w:p>
-      <w:pPr>
-        <w:spacing w:after="120"/>
-      </w:pPr>
-      <w:r>
-        <w:t xml:space="preserve">☐ Review AIM Services draft webpage content</w:t>
-      </w:r>
-      <w:r>
-        <w:rPr>
-          <w:i/>
-          <w:iCs/>
-          <w:color w:val="999999"/>
-        </w:rPr>
-        <w:t xml:space="preserve">   no SOP yet; consider adding one</w:t>
-      </w:r>
-    </w:p>
-    <w:p>
-      <w:pPr>
-        <w:spacing w:after="120"/>
-      </w:pPr>
-      <w:r>
-        <w:t xml:space="preserve">☐ Talk to Dave about Brian Schulte</w:t>
-      </w:r>
-      <w:r>
-        <w:rPr>
-          <w:i/>
-          <w:iCs/>
-          <w:color w:val="999999"/>
-        </w:rPr>
-        <w:t xml:space="preserve">   no SOP yet; consider adding one</w:t>
-      </w:r>
-    </w:p>
-    <w:p>
-      <w:pPr>
-        <w:spacing w:after="120"/>
-      </w:pPr>
-      <w:r>
-        <w:t xml:space="preserve">☐ Schedule time to work on IT posture</w:t>
-      </w:r>
-      <w:r>
-        <w:rPr>
-          <w:i/>
-          <w:iCs/>
-          <w:color w:val="999999"/>
-        </w:rPr>
-        <w:t xml:space="preserve">   no SOP yet; consider adding one</w:t>
-      </w:r>
-    </w:p>
-    <w:p>
-      <w:pPr>
-        <w:spacing w:after="120"/>
-      </w:pPr>
-      <w:r>
-        <w:t xml:space="preserve">☐ Verify the SA-Operations nightly backup ran (pending: log not reachable from Otto)</w:t>
-      </w:r>
-      <w:r>
-        <w:rPr>
-          <w:i/>
-          <w:iCs/>
-          <w:color w:val="999999"/>
-        </w:rPr>
-        <w:t xml:space="preserve">   no SOP yet; consider adding one</w:t>
-      </w:r>
-    </w:p>
-    <w:p>
-      <w:pPr>
         <w:pStyle w:val="Heading2"/>
         <w:spacing w:after="100" w:before="200"/>
       </w:pPr>
@@ -197,7 +95,7 @@
         </w:rPr>
         <w:t xml:space="preserve">   SOP: </w:t>
       </w:r>
-      <w:hyperlink w:history="1" r:id="rIdx2mfr5nmomaq3r2qldpau">
+      <w:hyperlink w:history="1" r:id="rIdjmqnc3tal5wozbd7xiovz">
         <w:r>
           <w:rPr>
             <w:rStyle w:val="Hyperlink"/>

</xml_diff>